<commit_message>
Rebuild the three Word documents on the corrected draft
The built documents were three days stale: they predated both the --isoform-agg
disclosure and today's upstream-drift corrections, so they still described four
closed issues as open.

Rebuilt and verified by reading the built files back, not by trusting the builder:
  - the corrected text is present ("were open when these results were produced",
    "closed 4 September 2026", "isoform-agg per_gene", "still open at the time of
    writing")
  - none of the four stale phrases survives in the submission copy
  - typography holds: body 11 pt, headings bold 12 pt, 18 legend paragraphs at
    10 pt per main copy, all body paragraphs justified
  - submission copy carries 0 images, reading copy 6 inline mains, as intended

build.sh's own 38 checks pass.

Co-Authored-By: Claude Opus 5 <noreply@anthropic.com>
</commit_message>
<xml_diff>
--- a/submission/PeakATail_manuscript_reading_copy.docx
+++ b/submission/PeakATail_manuscript_reading_copy.docx
@@ -746,7 +746,7 @@
         <w:rPr>
           <w:sz w:val="20"/>
         </w:rPr>
-        <w:t xml:space="preserve">(3.0% of label-shuffled tests p &lt; 0.05, 0/20 null runs with a q &lt; 0.05 hit) is Fig 4. Caveats that travel: atlas agreement is agreement with a curated atlas, not ground truth, so an atlas-novel true site counts as a false positive, and the recall denominator is the atlas restricted to genes detected in the dataset; the clip rate is one PBMC donor and one chemistry (CellRanger 3.0.0, 10x 3′ v3, 91 bp read 2), and any pipeline that trims poly(A) before alignment destroys this evidence channel entirely; the tier label reflects clip support, not gene assignment (PAS-to-gene assignment in overlapping loci is under revision, tool issue #99, so no gene-level claim is made here); neither rule the figure names is a shipped command-line default, since</w:t>
+        <w:t xml:space="preserve">(3.0% of label-shuffled tests p &lt; 0.05, 0/20 null runs with a q &lt; 0.05 hit) is Fig 4. Caveats that travel: atlas agreement is agreement with a curated atlas, not ground truth, so an atlas-novel true site counts as a false positive, and the recall denominator is the atlas restricted to genes detected in the dataset; the clip rate is one PBMC donor and one chemistry (CellRanger 3.0.0, 10x 3′ v3, 91 bp read 2), and any pipeline that trims poly(A) before alignment destroys this evidence channel entirely; the tier label reflects clip support, not gene assignment (PAS-to-gene assignment in overlapping loci was defective in the code behind this figure, tool issue #99, closed upstream by PR #104 only after 9dfdefb and with a residual acknowledged there, so no gene-level claim is made here); neither rule the figure names is a shipped command-line default, since</w:t>
       </w:r>
       <w:r>
         <w:rPr>
@@ -1416,7 +1416,7 @@
         <w:t xml:space="preserve"> </w:t>
       </w:r>
       <w:r>
-        <w:t xml:space="preserve">controls the false-discovery rate it states (Fig 4). A label-permutation harness on testis mouse 1 (1,230 cells with expression-derived stage labels, orthogonal to the PAS matrix under test; 76,711 PAS; three stage pairs) ran 20 permutations, shared identically across configurations, through the full pipeline (six configurations × 21 runs, zero failures): Fisher on read counts, Fisher on cell counts and a pairwise negative-binomial test, each with the shipped top-200 Wilcoxon marker pre-selection on and off.</w:t>
+        <w:t xml:space="preserve">controls the false-discovery rate it states (Fig 4). A label-permutation harness on testis mouse 1 (1,230 cells with expression-derived stage labels, orthogonal to the PAS matrix under test; 76,711 PAS; three stage pairs) ran 20 permutations, shared identically across configurations, through the full pipeline (six configurations × 21 runs, zero failures): Fisher on read counts, Fisher on cell counts and a pairwise negative-binomial test, each with v2's shipped top-200 Wilcoxon marker pre-selection on and off.</w:t>
       </w:r>
     </w:p>
     <w:p>
@@ -1513,7 +1513,32 @@
         <w:rPr>
           <w:sz w:val="20"/>
         </w:rPr>
-        <w:t xml:space="preserve">, the shipped default, or</w:t>
+        <w:t xml:space="preserve">, the default shipped at v2</w:t>
+      </w:r>
+      <w:r>
+        <w:rPr>
+          <w:sz w:val="20"/>
+        </w:rPr>
+        <w:t xml:space="preserve"> </w:t>
+      </w:r>
+      <w:r>
+        <w:rPr>
+          <w:rStyle w:val="VerbatimChar"/>
+          <w:sz w:val="20"/>
+        </w:rPr>
+        <w:t xml:space="preserve">9dfdefb</w:t>
+      </w:r>
+      <w:r>
+        <w:rPr>
+          <w:sz w:val="20"/>
+        </w:rPr>
+        <w:t xml:space="preserve"> </w:t>
+      </w:r>
+      <w:r>
+        <w:rPr>
+          <w:sz w:val="20"/>
+        </w:rPr>
+        <w:t xml:space="preserve">/ version 0.2.0, or</w:t>
       </w:r>
       <w:r>
         <w:rPr>
@@ -1532,7 +1557,51 @@
         <w:rPr>
           <w:sz w:val="20"/>
         </w:rPr>
-        <w:t xml:space="preserve">). All six are scored against the same label-permutation null run through the identical pipeline: testis mouse 1, 1,230 cells with expression-derived stage labels orthogonal to the PAS matrix under test (SPC 370 / RS 504 / ES 356), 76,711 PAS, three stage pairs, 20 permutations shared identically across configurations, the full</w:t>
+        <w:t xml:space="preserve">; PR #105 has since flipped that default to</w:t>
+      </w:r>
+      <w:r>
+        <w:rPr>
+          <w:sz w:val="20"/>
+        </w:rPr>
+        <w:t xml:space="preserve"> </w:t>
+      </w:r>
+      <w:r>
+        <w:rPr>
+          <w:rStyle w:val="VerbatimChar"/>
+          <w:sz w:val="20"/>
+        </w:rPr>
+        <w:t xml:space="preserve">0</w:t>
+      </w:r>
+      <w:r>
+        <w:rPr>
+          <w:sz w:val="20"/>
+        </w:rPr>
+        <w:t xml:space="preserve"> </w:t>
+      </w:r>
+      <w:r>
+        <w:rPr>
+          <w:sz w:val="20"/>
+        </w:rPr>
+        <w:t xml:space="preserve">on</w:t>
+      </w:r>
+      <w:r>
+        <w:rPr>
+          <w:sz w:val="20"/>
+        </w:rPr>
+        <w:t xml:space="preserve"> </w:t>
+      </w:r>
+      <w:r>
+        <w:rPr>
+          <w:rStyle w:val="VerbatimChar"/>
+          <w:sz w:val="20"/>
+        </w:rPr>
+        <w:t xml:space="preserve">develop</w:t>
+      </w:r>
+      <w:r>
+        <w:rPr>
+          <w:sz w:val="20"/>
+        </w:rPr>
+        <w:t xml:space="preserve">, version-bumped to 0.3.0). All six are scored against the same label-permutation null run through the identical pipeline: testis mouse 1, 1,230 cells with expression-derived stage labels orthogonal to the PAS matrix under test (SPC 370 / RS 504 / ES 356), 76,711 PAS, three stage pairs, 20 permutations shared identically across configurations, the full</w:t>
       </w:r>
       <w:r>
         <w:rPr>
@@ -1657,7 +1726,89 @@
         <w:rPr>
           <w:sz w:val="20"/>
         </w:rPr>
-        <w:t xml:space="preserve">The cost in the real, unpermuted comparison: the share of each configuration's nominal q &lt; 0.05 calls that survive permutation-calibrated q (bar; label = surviving count / all real-run calls), with a diamond marking the share that also clears the pre-registered effect floor (|Δproportion| ≥ 0.1 for Fisher, |log2FC| ≥ 1 for the negative binomial). Result: every arm that keeps the shipped top-200 marker pre-selection is anti-conservative (null p &lt; 0.05 of 20.3% for Fisher on reads, 13.0% for Fisher on cells and 24.7% for the negative binomial, with 19–20 of 20 null runs carrying a q &lt; 0.05 call), as are Fisher on reads (9.6%) and the negative binomial (5.1%) without it; Fisher on cells with pre-selection off is the one arm that controls the false-discovery rate (3.0% null p &lt; 0.05, 0.00% null q &lt; 0.05, 0 of 20 null runs with any hit), conservative rather than exact. Caveats that travel: marker pre-selection also computes the within-gene Fisher denominator from the marker-restricted matrix, so marker-on and marker-off are different tests rather than subsets, and their real-run hit counts are not comparable; one mouse and one tissue with very large true stage effects, so real-run hit counts are detectability upper bounds, not precision; the label-permutation null tests exchangeability under the global null only; a Kolmogorov–Smirnov test against uniform rejects for every arm because Fisher p-values are discrete (mass at p = 1), and is reported, not gated; "calibrated" is our pre-stated operational rule (null p &lt; 0.05 ≤ 7%, p &lt; 0.01 ≤ 1.5%, q &lt; 0.05 ≤ 5%, ≤ 25% of null runs with any hit), not a community standard. Per-configuration diagnostic depth is Fig S9.</w:t>
+        <w:t xml:space="preserve">The cost in the real, unpermuted comparison: the share of each configuration's nominal q &lt; 0.05 calls that survive permutation-calibrated q (bar; label = surviving count / all real-run calls), with a diamond marking the share that also clears the pre-registered effect floor (|Δproportion| ≥ 0.1 for Fisher, |log2FC| ≥ 1 for the negative binomial). Result: every arm that keeps the top-200 marker pre-selection that v2 shipped as its default is anti-conservative (null p &lt; 0.05 of 20.3% for Fisher on reads, 13.0% for Fisher on cells and 24.7% for the negative binomial, with 19–20 of 20 null runs carrying a q &lt; 0.05 call), as are Fisher on reads (9.6%) and the negative binomial (5.1%) without it; Fisher on cells with pre-selection off is the one arm that controls the false-discovery rate (3.0% null p &lt; 0.05, 0.00% null q &lt; 0.05, 0 of 20 null runs with any hit), conservative rather than exact. Caveats that travel: every switch result here is at</w:t>
+      </w:r>
+      <w:r>
+        <w:rPr>
+          <w:sz w:val="20"/>
+        </w:rPr>
+        <w:t xml:space="preserve"> </w:t>
+      </w:r>
+      <w:r>
+        <w:rPr>
+          <w:rStyle w:val="VerbatimChar"/>
+          <w:sz w:val="20"/>
+        </w:rPr>
+        <w:t xml:space="preserve">--isoform-agg per_gene</w:t>
+      </w:r>
+      <w:r>
+        <w:rPr>
+          <w:sz w:val="20"/>
+        </w:rPr>
+        <w:t xml:space="preserve">, so a "switch" is a shift in a PAS's share of its gene and not necessarily tandem 3′UTR polyadenylation, and the two are not the same event; re-running the same cells, labels and test at</w:t>
+      </w:r>
+      <w:r>
+        <w:rPr>
+          <w:sz w:val="20"/>
+        </w:rPr>
+        <w:t xml:space="preserve"> </w:t>
+      </w:r>
+      <w:r>
+        <w:rPr>
+          <w:rStyle w:val="VerbatimChar"/>
+          <w:sz w:val="20"/>
+        </w:rPr>
+        <w:t xml:space="preserve">--isoform-agg within_utr</w:t>
+      </w:r>
+      <w:r>
+        <w:rPr>
+          <w:sz w:val="20"/>
+        </w:rPr>
+        <w:t xml:space="preserve">, which scopes the denominator to the PAS sharing a 3′UTR isoform, reproduces 90.9% and 91.6% of the per-gene calls in the two mice (96.8–97.1% of within-UTR calls are also per-gene calls; 161,874 and 165,964 PAS × stage-pair tested by both), so the scope changes under a tenth of the calls but does change which event is being named; that comparison required repairing the released caller, in which</w:t>
+      </w:r>
+      <w:r>
+        <w:rPr>
+          <w:sz w:val="20"/>
+        </w:rPr>
+        <w:t xml:space="preserve"> </w:t>
+      </w:r>
+      <w:r>
+        <w:rPr>
+          <w:rStyle w:val="VerbatimChar"/>
+          <w:sz w:val="20"/>
+        </w:rPr>
+        <w:t xml:space="preserve">--isoform-agg within_utr</w:t>
+      </w:r>
+      <w:r>
+        <w:rPr>
+          <w:sz w:val="20"/>
+        </w:rPr>
+        <w:t xml:space="preserve"> </w:t>
+      </w:r>
+      <w:r>
+        <w:rPr>
+          <w:sz w:val="20"/>
+        </w:rPr>
+        <w:t xml:space="preserve">aborted on every invocation (two defects on a path with no test coverage, fixed in branch</w:t>
+      </w:r>
+      <w:r>
+        <w:rPr>
+          <w:sz w:val="20"/>
+        </w:rPr>
+        <w:t xml:space="preserve"> </w:t>
+      </w:r>
+      <w:r>
+        <w:rPr>
+          <w:rStyle w:val="VerbatimChar"/>
+          <w:sz w:val="20"/>
+        </w:rPr>
+        <w:t xml:space="preserve">fix/within-utr-nameerror</w:t>
+      </w:r>
+      <w:r>
+        <w:rPr>
+          <w:sz w:val="20"/>
+        </w:rPr>
+        <w:t xml:space="preserve">), so no published PeakATail version could run it; marker pre-selection also computes the within-gene Fisher denominator from the marker-restricted matrix, so marker-on and marker-off are different tests rather than subsets, and their real-run hit counts are not comparable; one mouse and one tissue with very large true stage effects, so real-run hit counts are detectability upper bounds, not precision; the label-permutation null tests exchangeability under the global null only; a Kolmogorov–Smirnov test against uniform rejects for every arm because Fisher p-values are discrete (mass at p = 1), and is reported, not gated; "calibrated" is our pre-stated operational rule (null p &lt; 0.05 ≤ 7%, p &lt; 0.01 ≤ 1.5%, q &lt; 0.05 ≤ 5%, ≤ 25% of null runs with any hit), not a community standard. Per-configuration diagnostic depth is Fig S9.</w:t>
       </w:r>
     </w:p>
     <w:p>
@@ -1681,7 +1832,7 @@
         <w:pStyle w:val="BodyText"/>
       </w:pPr>
       <w:r>
-        <w:t xml:space="preserve">PeakATail therefore ships Fisher on cells with pre-selection off (</w:t>
+        <w:t xml:space="preserve">PeakATail therefore changed its shipped configuration to Fisher on cells with pre-selection off (</w:t>
       </w:r>
       <w:r>
         <w:rPr>
@@ -1690,7 +1841,115 @@
         <w:t xml:space="preserve">--marker-top-n 0</w:t>
       </w:r>
       <w:r>
-        <w:t xml:space="preserve">, nominal Benjamini–Hochberg q; Benjamini and Hochberg, 1995) as its only default, and requires permutation-calibrated q whenever pre-selection or the negative-binomial test is used (Fig S9d). "Calibrated" is our pre-stated operational rule (null p &lt; 0.05 ≤ 7%, p &lt; 0.01 ≤ 1.5%, q &lt; 0.05 ≤ 5%, ≤ 25% of null runs with any hit), not a community standard, and the assessment rests on one mouse and one tissue with very large true stage effects. The harness measures only this tool's test: no competitor's differential test has been run through it, so Background's field-level concern about uncalibrated shipped defaults is, for every other tool, a hypothesis this paper does not test.</w:t>
+        <w:t xml:space="preserve">, nominal Benjamini–Hochberg q; Benjamini and Hochberg, 1995) as its only default, and requires permutation-calibrated q whenever pre-selection or the negative-binomial test is used (Fig S9d). That flip is post-freeze and does not describe the code behind this paper: at v2 (</w:t>
+      </w:r>
+      <w:r>
+        <w:rPr>
+          <w:rStyle w:val="VerbatimChar"/>
+        </w:rPr>
+        <w:t xml:space="preserve">9dfdefb3</w:t>
+      </w:r>
+      <w:r>
+        <w:t xml:space="preserve">)</w:t>
+      </w:r>
+      <w:r>
+        <w:t xml:space="preserve"> </w:t>
+      </w:r>
+      <w:r>
+        <w:rPr>
+          <w:rStyle w:val="VerbatimChar"/>
+        </w:rPr>
+        <w:t xml:space="preserve">--marker-top-n</w:t>
+      </w:r>
+      <w:r>
+        <w:t xml:space="preserve"> </w:t>
+      </w:r>
+      <w:r>
+        <w:t xml:space="preserve">still defaults to 200, and only PR #105 (merge commit</w:t>
+      </w:r>
+      <w:r>
+        <w:t xml:space="preserve"> </w:t>
+      </w:r>
+      <w:r>
+        <w:rPr>
+          <w:rStyle w:val="VerbatimChar"/>
+        </w:rPr>
+        <w:t xml:space="preserve">c978e81</w:t>
+      </w:r>
+      <w:r>
+        <w:t xml:space="preserve">, 2026-09-03 UTC, 13 days after the freeze) changed the default to 0. A flagless</w:t>
+      </w:r>
+      <w:r>
+        <w:t xml:space="preserve"> </w:t>
+      </w:r>
+      <w:r>
+        <w:rPr>
+          <w:rStyle w:val="VerbatimChar"/>
+        </w:rPr>
+        <w:t xml:space="preserve">peakatail switch diff</w:t>
+      </w:r>
+      <w:r>
+        <w:t xml:space="preserve"> </w:t>
+      </w:r>
+      <w:r>
+        <w:t xml:space="preserve">at this paper's own frozen commit therefore runs the anti-conservative 13.0% arm, and every switch result reported here required passing</w:t>
+      </w:r>
+      <w:r>
+        <w:t xml:space="preserve"> </w:t>
+      </w:r>
+      <w:r>
+        <w:rPr>
+          <w:rStyle w:val="VerbatimChar"/>
+        </w:rPr>
+        <w:t xml:space="preserve">--marker-top-n 0</w:t>
+      </w:r>
+      <w:r>
+        <w:t xml:space="preserve"> </w:t>
+      </w:r>
+      <w:r>
+        <w:t xml:space="preserve">explicitly;</w:t>
+      </w:r>
+      <w:r>
+        <w:t xml:space="preserve"> </w:t>
+      </w:r>
+      <w:r>
+        <w:rPr>
+          <w:rStyle w:val="VerbatimChar"/>
+        </w:rPr>
+        <w:t xml:space="preserve">--strategy fisher</w:t>
+      </w:r>
+      <w:r>
+        <w:t xml:space="preserve"> </w:t>
+      </w:r>
+      <w:r>
+        <w:t xml:space="preserve">and</w:t>
+      </w:r>
+      <w:r>
+        <w:t xml:space="preserve"> </w:t>
+      </w:r>
+      <w:r>
+        <w:rPr>
+          <w:rStyle w:val="VerbatimChar"/>
+        </w:rPr>
+        <w:t xml:space="preserve">--count-mode cells</w:t>
+      </w:r>
+      <w:r>
+        <w:t xml:space="preserve"> </w:t>
+      </w:r>
+      <w:r>
+        <w:t xml:space="preserve">are already the defaults at</w:t>
+      </w:r>
+      <w:r>
+        <w:t xml:space="preserve"> </w:t>
+      </w:r>
+      <w:r>
+        <w:rPr>
+          <w:rStyle w:val="VerbatimChar"/>
+        </w:rPr>
+        <w:t xml:space="preserve">9dfdefb</w:t>
+      </w:r>
+      <w:r>
+        <w:t xml:space="preserve">, so the marker flag is the only one a reproducer must add., and requires permutation-calibrated q whenever pre-selection or the negative-binomial test is used (Fig S9d). "Calibrated" is our pre-stated operational rule (null p &lt; 0.05 ≤ 7%, p &lt; 0.01 ≤ 1.5%, q &lt; 0.05 ≤ 5%, ≤ 25% of null runs with any hit), not a community standard, and the assessment rests on one mouse and one tissue with very large true stage effects. The harness measures only this tool's test: no competitor's differential test has been run through it, so Background's field-level concern about uncalibrated shipped defaults is, for every other tool, a hypothesis this paper does not test.</w:t>
       </w:r>
     </w:p>
     <w:p>
@@ -2004,7 +2263,7 @@
         <w:rPr>
           <w:sz w:val="20"/>
         </w:rPr>
-        <w:t xml:space="preserve">Of the 16 genes of the curated literature panel measurable in both mice, only 4 shorten in both (Prm3, Ybx2, Ppp1cc, Nsun7), 5 lengthen in both (Prm1, Tnp2, Odf1, Spata19, Smcp), 5 are discordant and 2 uninformative. Caveats that travel: monotone lengthening is also above its null, because a label shuffle destroys ordered structure of either sign, so never write "shortening is above null" without the lengthening column, and quote the excess; the per-gene medians are not monotone (RS sits marginally above SPC in both mice) and must never be quoted as the gradient, which is carried by panel a, the paired per-gene tests and the per-cell residual of panel b; the statistic is the depth-weighted pseudobulk PDUI and that choice must be stated wherever these numbers are used, the cell-weighted arm being unusable at this depth; a bare Wilcoxon p from this design is not interpretable without its shuffle-null column; spermatogonia are excluded from the claim, because they lengthen under exactly this labelling on 64 / 68 cells; gene-level and across-gene UMI-weighted summaries disagree in direction (panels a–d against panel e) and both are reported, and across-gene UMI weighting is not used for the claim; per-gene reproducibility and net shortening are different claims and must not be conflated (ρ 0.641 against 339 both-shorten vs 273 both-lengthen, binomial p 0.0085); replication here is two mice of one study, one protocol and one chemistry with argmax expression labels, so animal-level noise is controlled and protocol-level artefacts are not; the switch test's null is conservative rather than exact, so the true hit counts are not a count of true switches, and cross-mouse PAS matching is coordinate-based, so only the matched subset (~60% of tested PAS) can replicate; the ≥50-UMI depth guard biases the surviving gene set toward highly expressed genes (the shuffle null uses the same guarded set); the literature panel is a named-gene measurement and runs through the PAS-to-gene assignment under revision in overlapping loci (tool issue #99), which is not excluded for individual panel verdicts; and the 3′UTR-scoped PDUI arm still cannot be produced (tool issue #98).</w:t>
+        <w:t xml:space="preserve">Of the 16 genes of the curated literature panel measurable in both mice, only 4 shorten in both (Prm3, Ybx2, Ppp1cc, Nsun7), 5 lengthen in both (Prm1, Tnp2, Odf1, Spata19, Smcp), 5 are discordant and 2 uninformative. Caveats that travel: monotone lengthening is also above its null, because a label shuffle destroys ordered structure of either sign, so never write "shortening is above null" without the lengthening column, and quote the excess; the per-gene medians are not monotone (RS sits marginally above SPC in both mice) and must never be quoted as the gradient, which is carried by panel a, the paired per-gene tests and the per-cell residual of panel b; the statistic is the depth-weighted pseudobulk PDUI and that choice must be stated wherever these numbers are used, the cell-weighted arm being unusable at this depth; a bare Wilcoxon p from this design is not interpretable without its shuffle-null column; spermatogonia are excluded from the claim, because they lengthen under exactly this labelling on 64 / 68 cells; gene-level and across-gene UMI-weighted summaries disagree in direction (panels a–d against panel e) and both are reported, and across-gene UMI weighting is not used for the claim; per-gene reproducibility and net shortening are different claims and must not be conflated (ρ 0.641 against 339 both-shorten vs 273 both-lengthen, binomial p 0.0085); replication here is two mice of one study, one protocol and one chemistry with argmax expression labels, so animal-level noise is controlled and protocol-level artefacts are not; the switch test's null is conservative rather than exact, so the true hit counts are not a count of true switches, and cross-mouse PAS matching is coordinate-based, so only the matched subset (~60% of tested PAS) can replicate; the ≥50-UMI depth guard biases the surviving gene set toward highly expressed genes (the shuffle null uses the same guarded set); the literature panel is a named-gene measurement and runs through the PAS-to-gene assignment that was defective in overlapping loci at the frozen commit (tool issue #99; the assignment half was reworked upstream after the freeze by PR #104, with a documented residual, and none of that code is behind this figure), which is not excluded for individual panel verdicts; and the 3′UTR-scoped PDUI arm could not be produced by the frozen code and is absent here (tool issue #98, fixed upstream after the freeze by PR #106, merged 2026-09-03 as 3f77717; that fix is not in 9dfdefb3 and so is not in the code behind this figure).</w:t>
       </w:r>
     </w:p>
     <w:p>
@@ -2036,7 +2295,7 @@
         <w:pStyle w:val="BodyText"/>
       </w:pPr>
       <w:r>
-        <w:t xml:space="preserve">Two results ran against expectation; Fig 5e, f box them as findings, not footnotes. The across-gene UMI-weighted distal index reverses at RS→ES in both mice (Cliff's δ −0.93 / −0.87): protamine transcripts at ceiling PDUI alone carry 25.2% and 14.5% of guarded elongating-spermatid UMIs, so gene-level and UMI-weighted summaries disagree in direction and both are reported. And of the 16 genes of a curated literature shortening panel measurable in both mice [[CITE: literature sources of the spermatogenesis 3′UTR-shortening gene panel]], only 4 shorten in both, 5 lengthen in both, 5 are discordant and 2 are uninformative: the panel does not reproduce under our PAS-to-gene assignment, is dropped as a positive control, and only the per-gene, null-referenced statement stands. One alternative explanation is not excluded here: a named-gene measurement runs through the PAS-to-gene assignment that is under revision in overlapping loci (tool issue #99), so per-gene mis-assignment could contribute to individual panel verdicts. Replication here is two mice of one study and one chemistry: it controls animal-level noise, not protocol-level artefacts.</w:t>
+        <w:t xml:space="preserve">Two results ran against expectation; Fig 5e, f box them as findings, not footnotes. The across-gene UMI-weighted distal index reverses at RS→ES in both mice (Cliff's δ −0.93 / −0.87): protamine transcripts at ceiling PDUI alone carry 25.2% and 14.5% of guarded elongating-spermatid UMIs, so gene-level and UMI-weighted summaries disagree in direction and both are reported. And of the 16 genes of a curated literature shortening panel measurable in both mice [[CITE: literature sources of the spermatogenesis 3′UTR-shortening gene panel]], only 4 shorten in both, 5 lengthen in both, 5 are discordant and 2 are uninformative: the panel does not reproduce under our PAS-to-gene assignment, is dropped as a positive control, and only the per-gene, null-referenced statement stands. One alternative explanation is not excluded here: a named-gene measurement runs through the PAS-to-gene assignment that was defective in overlapping loci in the code that produced these numbers (tool issue #99, closed upstream after the freeze by PR #104, which reworked the tie-break but leaves a residual footprint approximation; nothing here is recomputed under it), so per-gene mis-assignment could contribute to individual panel verdicts. Replication here is two mice of one study and one chemistry: it controls animal-level noise, not protocol-level artefacts.</w:t>
       </w:r>
     </w:p>
     <w:p>
@@ -2250,7 +2509,76 @@
         <w:rPr>
           <w:sz w:val="20"/>
         </w:rPr>
-        <w:t xml:space="preserve">Honesty panel, the genomic context of the 5,951 distinct replicated PAS, drawn as an exclusive strand-matched partition: 57.8% in the assigned gene's own 3′UTR, 3.7% in another gene's 3′UTR, 13.7% exonic but not 3′UTR, 21.6% intronic and 3.2% outside any same-strand gene, i.e. 96.8% inside a same-strand gene body and 61.5% in some same-strand 3′UTR. Caveats that travel: the two 3′UTR figures must never be conflated, and the own-gene figure (57.8%) is the one to use whenever the claim is about gene-level interpretation; that fraction, like the 2,883-gene and 10,415 (pair, gene) counts, is computed through the PAS-to-gene assignment under revision (tool issue #99), while every PAS-keyed statistic is unaffected; the null resolves only to an empirical p ≤ 0.091, the ten-permutation floor, so report "none in ten label-shuffle nulls" and never an FDR; no ranked list of named top-switch genes may be published until the assignment is fixed, because 12 of the top-30 gene-level rows name a gene whose 3′UTR does not contain the representative PAS; the pre-registered effect floor is applied per patient and the patients are then re-counted, so it removes 730 switches (15,942 → 15,212), more than the 291 whose consensus effect alone falls below 0.1, so never quote the consensus-below-floor count as the floor's yield; the MetBone exclusion is pre-registered but its stated premise was wrong (the near-zero clip rate behind it was a head-of-BAM sampling artefact), and the 13-patient sensitivity run differs by 0.4%, confined to one pair; pairs tested in more patients replicate more, so panel b tracks cohort composition as much as biology, and two thirds of the replicated set rests on the two-patient minimum (panel c), the weakest support the pre-registration allows; one library trips the per-run null rule only through Benjamini–Hochberg discreteness (3 hits in 9.1 M null tests) and is kept and disclosed; one cohort, one chemistry, one caller, with no orthogonal 3′-end assay confirming these sites; these are v2-code numbers, and the v1-code chain recorded 14,480 replicated over a 74,954-PAS universe and remains reproducible as a labelled comparison.</w:t>
+        <w:t xml:space="preserve">Honesty panel, the genomic context of the 5,951 distinct replicated PAS, drawn as an exclusive strand-matched partition: 57.8% in the assigned gene's own 3′UTR, 3.7% in another gene's 3′UTR, 13.7% exonic but not 3′UTR, 21.6% intronic and 3.2% outside any same-strand gene, i.e. 96.8% inside a same-strand gene body and 61.5% in some same-strand 3′UTR. Caveats that travel: the two 3′UTR figures must never be conflated, and the own-gene figure (57.8%) is the one to use whenever the claim is about gene-level interpretation; that fraction, like the 2,883-gene and 10,415 (pair, gene) counts, is computed through the PAS-to-gene assignment that was defective at</w:t>
+      </w:r>
+      <w:r>
+        <w:rPr>
+          <w:sz w:val="20"/>
+        </w:rPr>
+        <w:t xml:space="preserve"> </w:t>
+      </w:r>
+      <w:r>
+        <w:rPr>
+          <w:rStyle w:val="VerbatimChar"/>
+          <w:sz w:val="20"/>
+        </w:rPr>
+        <w:t xml:space="preserve">9dfdefb</w:t>
+      </w:r>
+      <w:r>
+        <w:rPr>
+          <w:sz w:val="20"/>
+        </w:rPr>
+        <w:t xml:space="preserve"> </w:t>
+      </w:r>
+      <w:r>
+        <w:rPr>
+          <w:sz w:val="20"/>
+        </w:rPr>
+        <w:t xml:space="preserve">(tool issue #99; repaired upstream in PR #104 after these results were frozen, so the counts reported here retain the defect and would change on a re-run), while every PAS-keyed statistic is unaffected; the null resolves only to an empirical p ≤ 0.091, the ten-permutation floor, so report "none in ten label-shuffle nulls" and never an FDR; no ranked list of named top-switch genes may be published from these runs, because 12 of the top-30 gene-level rows name a gene whose 3′UTR does not contain the representative PAS; the assignment fix (PR #104) merged on 2026-09-03, 13 days after this paper's v2 freeze at</w:t>
+      </w:r>
+      <w:r>
+        <w:rPr>
+          <w:sz w:val="20"/>
+        </w:rPr>
+        <w:t xml:space="preserve"> </w:t>
+      </w:r>
+      <w:r>
+        <w:rPr>
+          <w:rStyle w:val="VerbatimChar"/>
+          <w:sz w:val="20"/>
+        </w:rPr>
+        <w:t xml:space="preserve">9dfdefb</w:t>
+      </w:r>
+      <w:r>
+        <w:rPr>
+          <w:sz w:val="20"/>
+        </w:rPr>
+        <w:t xml:space="preserve">, so it is in none of the code that produced any number here, and such a list becomes publishable only once the cohort is re-run on the fixed assignment — and then only with the residual recorded on issue #99, that</w:t>
+      </w:r>
+      <w:r>
+        <w:rPr>
+          <w:sz w:val="20"/>
+        </w:rPr>
+        <w:t xml:space="preserve"> </w:t>
+      </w:r>
+      <w:r>
+        <w:rPr>
+          <w:rStyle w:val="VerbatimChar"/>
+          <w:sz w:val="20"/>
+        </w:rPr>
+        <w:t xml:space="preserve">in_utr</w:t>
+      </w:r>
+      <w:r>
+        <w:rPr>
+          <w:sz w:val="20"/>
+        </w:rPr>
+        <w:t xml:space="preserve"> </w:t>
+      </w:r>
+      <w:r>
+        <w:rPr>
+          <w:sz w:val="20"/>
+        </w:rPr>
+        <w:t xml:space="preserve">still tests a gene-length footprint anchored at the gene terminus rather than real UTR intervals, so a minority of contested assignments (96 of 465 relabels in the fix's own audit) still resolve by terminus proximity; the pre-registered effect floor is applied per patient and the patients are then re-counted, so it removes 730 switches (15,942 → 15,212), more than the 291 whose consensus effect alone falls below 0.1, so never quote the consensus-below-floor count as the floor's yield; the MetBone exclusion is pre-registered but its stated premise was wrong (the near-zero clip rate behind it was a head-of-BAM sampling artefact), and the 13-patient sensitivity run differs by 0.4%, confined to one pair; pairs tested in more patients replicate more, so panel b tracks cohort composition as much as biology, and two thirds of the replicated set rests on the two-patient minimum (panel c), the weakest support the pre-registration allows; one library trips the per-run null rule only through Benjamini–Hochberg discreteness (3 hits in 9.1 M null tests) and is kept and disclosed; one cohort, one chemistry, one caller, with no orthogonal 3′-end assay confirming these sites; these are v2-code numbers, and the v1-code chain recorded 14,480 replicated over a 74,954-PAS universe and remains reproducible as a labelled comparison.</w:t>
       </w:r>
     </w:p>
     <w:p>
@@ -2274,7 +2602,19 @@
         <w:pStyle w:val="BodyText"/>
       </w:pPr>
       <w:r>
-        <w:t xml:space="preserve">Two disclosures bound Fig 6. The MetBone exclusion stands because it was pre-registered, but its stated premise was wrong: the near-zero clip-rate estimate behind it came from a QC estimator sampling only the first 200,000 cell-barcoded reads of a coordinate-sorted BAM (tool issue #99). MetBone in fact carries 306,202 clip molecules (30.2% of its 28,983 post-tier-filter PAS hold ≥2 of its own clip molecules); the sensitivity run including it differs by 0.42%, confined to the one pair it contributes. Second, no ranked list of named top-switch genes is reported: in overlapping loci, 12 of the top-30 gene-level rows (40%) have a representative PAS outside the named gene's 3′UTR and 8 of 30 (27%) sit in a different gene's 3′UTR, so switch results stay keyed by PAS identifier, with replication statistics unaffected, until PAS-to-gene re-assignment lands (the same issue). Fig 6d gives the genomic context of the 5,951 replicated PAS: 96.8% inside a same-strand gene body, 61.5% in some same-strand 3′UTR, 57.8% in the assigned gene's own 3′UTR. The gene-keyed quantities, namely 2,883 genes, the 10,415 (pair, gene) combinations and the 57.8% own-3′UTR fraction, are computed through that same assignment and carry the same caution as the withheld gene list; the gene-body and any-same-strand-3′UTR fractions and every PAS-level statistic do not depend on choosing an assigned gene.</w:t>
+        <w:t xml:space="preserve">Two disclosures bound Fig 6. The MetBone exclusion stands because it was pre-registered, but its stated premise was wrong: the near-zero clip-rate estimate behind it came from a QC estimator sampling only the first 200,000 cell-barcoded reads of a coordinate-sorted BAM (tool issue #99). MetBone in fact carries 306,202 clip molecules (30.2% of its 28,983 post-tier-filter PAS hold ≥2 of its own clip molecules); the sensitivity run including it differs by 0.42%, confined to the one pair it contributes. Second, no ranked list of named top-switch genes is reported: in overlapping loci, 12 of the top-30 gene-level rows (40%) have a representative PAS outside the named gene's 3′UTR and 8 of 30 (27%) sit in a different gene's 3′UTR, so switch results stay keyed by PAS identifier, with replication statistics unaffected; the overlapping-loci half of that issue was reworked upstream after this paper's freeze (PR #104, merge commit</w:t>
+      </w:r>
+      <w:r>
+        <w:t xml:space="preserve"> </w:t>
+      </w:r>
+      <w:r>
+        <w:rPr>
+          <w:rStyle w:val="VerbatimChar"/>
+        </w:rPr>
+        <w:t xml:space="preserve">71e3ade</w:t>
+      </w:r>
+      <w:r>
+        <w:t xml:space="preserve">, which resolves PAS-to-gene ties from the annotation instead of terminus proximity and recovers CD68 on chr17), it is not in the v2 code that produced these numbers, and its authors disclose a residual — the 3'UTR test still uses a fixed-length footprint anchored at the gene terminus, so 96 of 465 chr17 relabels are still decided by proximity — so the gene list stays withheld here and its release would require both that assignment and a re-run of these results on it. Fig 6d gives the genomic context of the 5,951 replicated PAS: 96.8% inside a same-strand gene body, 61.5% in some same-strand 3′UTR, 57.8% in the assigned gene's own 3′UTR. The gene-keyed quantities, namely 2,883 genes, the 10,415 (pair, gene) combinations and the 57.8% own-3′UTR fraction, are computed through that same assignment and carry the same caution as the withheld gene list; the gene-body and any-same-strand-3′UTR fractions and every PAS-level statistic do not depend on choosing an assigned gene.</w:t>
       </w:r>
     </w:p>
     <w:p>
@@ -2402,7 +2742,61 @@
         <w:pStyle w:val="BodyText"/>
       </w:pPr>
       <w:r>
-        <w:t xml:space="preserve">Limitations. The human results rest on one donor at depth; the second library (pbmc4k), whose pre-registered default gate returned PASS at atlas-agreement P@100 0.8279 with cross-donor site concordance of 84.2% within 100 bp (descriptive, not gated; Fig S4), carries no published donor identifier and is presumptively, not provably, a second individual. The two testis mice come from one study and one chemistry. The Kinnex truth is donor-mismatched and site-level: it corroborates positions, not donor-specific usage. Two defects are open publicly: PAS-to-gene assignment in overlapping loci is under revision (issue #99), so cohort switches are keyed by PAS identifier and no ranked gene list appears here; and the per_isoform switch mode has a degenerate-pair defect (issue #98) and underlies no result here.</w:t>
+        <w:t xml:space="preserve">Limitations. The human results rest on one donor at depth; the second library (pbmc4k), whose pre-registered default gate returned PASS at atlas-agreement P@100 0.8279 with cross-donor site concordance of 84.2% within 100 bp (descriptive, not gated; Fig S4), carries no published donor identifier and is presumptively, not provably, a second individual. The two testis mice come from one study and one chemistry. The Kinnex truth is donor-mismatched and site-level: it corroborates positions, not donor-specific usage. Two defects were open when these results were produced and are present in them; both were closed upstream only after the frozen commits, so neither fix is in this paper's numbers. PAS-to-gene assignment in overlapping loci was wrong in v2 (issue #99, closed 4 September 2026 — its assignment half by PR #104, merged 3 September, which the maintainer records as still approximating 3′UTR footprints by gene-terminus distance in a minority of ties, and its separate clip-rate-estimator half by PR #100), so cohort switches here are keyed by PAS identifier and no ranked gene list appears here; and the per_isoform switch mode had a degenerate-pair defect in v2 (issue #98, closed 3 September 2026 by PR #106) and underlies no result here. A third cited defect is still open at the time of writing, the switch test's default marker pre-selection (issue #94): PR #105 flipped the shipped default to</w:t>
+      </w:r>
+      <w:r>
+        <w:t xml:space="preserve"> </w:t>
+      </w:r>
+      <w:r>
+        <w:rPr>
+          <w:rStyle w:val="VerbatimChar"/>
+        </w:rPr>
+        <w:t xml:space="preserve">--marker-top-n 0</w:t>
+      </w:r>
+      <w:r>
+        <w:t xml:space="preserve"> </w:t>
+      </w:r>
+      <w:r>
+        <w:t xml:space="preserve">and took the Fisher denominator from the full count matrix, while a label-independent pre-filter, the</w:t>
+      </w:r>
+      <w:r>
+        <w:t xml:space="preserve"> </w:t>
+      </w:r>
+      <w:r>
+        <w:rPr>
+          <w:rStyle w:val="VerbatimChar"/>
+        </w:rPr>
+        <w:t xml:space="preserve">nb_pairwise</w:t>
+      </w:r>
+      <w:r>
+        <w:t xml:space="preserve"> </w:t>
+      </w:r>
+      <w:r>
+        <w:t xml:space="preserve">dispersion floor, the</w:t>
+      </w:r>
+      <w:r>
+        <w:t xml:space="preserve"> </w:t>
+      </w:r>
+      <w:r>
+        <w:rPr>
+          <w:rStyle w:val="VerbatimChar"/>
+        </w:rPr>
+        <w:t xml:space="preserve">within_utr</w:t>
+      </w:r>
+      <w:r>
+        <w:t xml:space="preserve">/</w:t>
+      </w:r>
+      <w:r>
+        <w:rPr>
+          <w:rStyle w:val="VerbatimChar"/>
+        </w:rPr>
+        <w:t xml:space="preserve">between_utr</w:t>
+      </w:r>
+      <w:r>
+        <w:t xml:space="preserve"> </w:t>
+      </w:r>
+      <w:r>
+        <w:t xml:space="preserve">denominator, two documentation defects and the run-manifest commit hash remain. It bears on no result reported here, every one of which was run with marker pre-selection off.</w:t>
       </w:r>
     </w:p>
     <w:p>
@@ -2995,7 +3389,19 @@
         <w:t xml:space="preserve">--ip-a-fraction 0.7</w:t>
       </w:r>
       <w:r>
-        <w:t xml:space="preserve">). The tool's</w:t>
+        <w:t xml:space="preserve">). At v2 the veto itself was opt-in behind</w:t>
+      </w:r>
+      <w:r>
+        <w:t xml:space="preserve"> </w:t>
+      </w:r>
+      <w:r>
+        <w:rPr>
+          <w:rStyle w:val="VerbatimChar"/>
+        </w:rPr>
+        <w:t xml:space="preserve">--ip-filter</w:t>
+      </w:r>
+      <w:r>
+        <w:t xml:space="preserve">, and</w:t>
       </w:r>
       <w:r>
         <w:t xml:space="preserve"> </w:t>
@@ -3010,7 +3416,7 @@
         <w:t xml:space="preserve"> </w:t>
       </w:r>
       <w:r>
-        <w:t xml:space="preserve">default,</w:t>
+        <w:t xml:space="preserve">defaulted to</w:t>
       </w:r>
       <w:r>
         <w:t xml:space="preserve"> </w:t>
@@ -3022,7 +3428,7 @@
         <w:t xml:space="preserve">annotate</w:t>
       </w:r>
       <w:r>
-        <w:t xml:space="preserve">, keeps every site and records the flag; every benchmark arm passed</w:t>
+        <w:t xml:space="preserve">, which keeps every site and only records the flag; every benchmark arm therefore passed</w:t>
       </w:r>
       <w:r>
         <w:t xml:space="preserve"> </w:t>
@@ -3037,7 +3443,76 @@
         <w:t xml:space="preserve"> </w:t>
       </w:r>
       <w:r>
-        <w:t xml:space="preserve">explicitly, which removes flagged sites. PR #96 corrected the minus-strand anchoring: the forward-coordinate window had been applied to both strands, testing minus-strand sites over the wrong sequence. The fix leaves plus-strand output byte-identical and, on</w:t>
+        <w:t xml:space="preserve">explicitly, which removes flagged sites. Both defaults have since changed on</w:t>
+      </w:r>
+      <w:r>
+        <w:t xml:space="preserve"> </w:t>
+      </w:r>
+      <w:r>
+        <w:rPr>
+          <w:rStyle w:val="VerbatimChar"/>
+        </w:rPr>
+        <w:t xml:space="preserve">develop</w:t>
+      </w:r>
+      <w:r>
+        <w:t xml:space="preserve">, in PR #100 (merged 2026-09-04, after every run reported here):</w:t>
+      </w:r>
+      <w:r>
+        <w:t xml:space="preserve"> </w:t>
+      </w:r>
+      <w:r>
+        <w:rPr>
+          <w:rStyle w:val="VerbatimChar"/>
+        </w:rPr>
+        <w:t xml:space="preserve">--ip-filter-default auto</w:t>
+      </w:r>
+      <w:r>
+        <w:t xml:space="preserve"> </w:t>
+      </w:r>
+      <w:r>
+        <w:t xml:space="preserve">runs the veto whenever a</w:t>
+      </w:r>
+      <w:r>
+        <w:t xml:space="preserve"> </w:t>
+      </w:r>
+      <w:r>
+        <w:rPr>
+          <w:rStyle w:val="VerbatimChar"/>
+        </w:rPr>
+        <w:t xml:space="preserve">--genome-fasta</w:t>
+      </w:r>
+      <w:r>
+        <w:t xml:space="preserve"> </w:t>
+      </w:r>
+      <w:r>
+        <w:t xml:space="preserve">is supplied, and</w:t>
+      </w:r>
+      <w:r>
+        <w:t xml:space="preserve"> </w:t>
+      </w:r>
+      <w:r>
+        <w:rPr>
+          <w:rStyle w:val="VerbatimChar"/>
+        </w:rPr>
+        <w:t xml:space="preserve">--ip-filter-mode auto</w:t>
+      </w:r>
+      <w:r>
+        <w:t xml:space="preserve"> </w:t>
+      </w:r>
+      <w:r>
+        <w:t xml:space="preserve">resolves to</w:t>
+      </w:r>
+      <w:r>
+        <w:t xml:space="preserve"> </w:t>
+      </w:r>
+      <w:r>
+        <w:rPr>
+          <w:rStyle w:val="VerbatimChar"/>
+        </w:rPr>
+        <w:t xml:space="preserve">filter</w:t>
+      </w:r>
+      <w:r>
+        <w:t xml:space="preserve">. That is the breaking change behind the 0.2.0 → 0.3.0 version bump. Because every arm here names both flags explicitly, the call sets scored in this paper are identical under either default, and no number reported here was produced with the new one. PR #96 corrected the minus-strand anchoring: the forward-coordinate window had been applied to both strands, testing minus-strand sites over the wrong sequence. The fix leaves plus-strand output byte-identical and, on</w:t>
       </w:r>
       <w:r>
         <w:t xml:space="preserve"> </w:t>
@@ -3619,7 +4094,19 @@
         <w:t xml:space="preserve">--marker-top-n 0</w:t>
       </w:r>
       <w:r>
-        <w:t xml:space="preserve">); Benjamini–Hochberg correction (Benjamini and Hochberg, 1995) is applied per cell-type pair within each library, so that each (library, pair) is one BH family, and |Δproportion| is reported as the effect size. Genes with a single tested PAS yield no table and are dropped.</w:t>
+        <w:t xml:space="preserve">), at the default aggregation scope</w:t>
+      </w:r>
+      <w:r>
+        <w:t xml:space="preserve"> </w:t>
+      </w:r>
+      <w:r>
+        <w:rPr>
+          <w:rStyle w:val="VerbatimChar"/>
+        </w:rPr>
+        <w:t xml:space="preserve">--isoform-agg per_gene</w:t>
+      </w:r>
+      <w:r>
+        <w:t xml:space="preserve">, in which each PAS is tested against the remainder of its gene rather than against the other sites of its own 3′UTR isoform; Benjamini–Hochberg correction (Benjamini and Hochberg, 1995) is applied per cell-type pair within each library, so that each (library, pair) is one BH family, and |Δproportion| is reported as the effect size. Genes with a single tested PAS yield no table and are dropped.</w:t>
       </w:r>
     </w:p>
     <w:p>
@@ -3852,7 +4339,7 @@
         <w:t xml:space="preserve">replication primary is 15 libraries from 12 patients</w:t>
       </w:r>
       <w:r>
-        <w:t xml:space="preserve">: GSM3516664 (bone metastasis) is excluded by a pre-declared data-quality rule whose stated premise later proved to be a clip-rate sampling artefact of the head-of-BAM estimator, so the exclusion stands only as pre-registered, with a sensitivity run including it reported; and GSM3516671 retains one confirmed cell type, so it yields no testable pair. Null combinations are index-aligned; ten permutations floor the empirical p at 1/11 = 0.091, so the null yield is a null control ("none in 10 label-shuffle nulls, empirical p ≤ 0.091"), never an FDR estimate. Replication statistics are computed on PAS identifiers; no ranked list of named switch genes is reported, because PAS-to-gene assignment in overlapping loci is under revision (tool issue #99).</w:t>
+        <w:t xml:space="preserve">: GSM3516664 (bone metastasis) is excluded by a pre-declared data-quality rule whose stated premise later proved to be a clip-rate sampling artefact of the head-of-BAM estimator, so the exclusion stands only as pre-registered, with a sensitivity run including it reported; and GSM3516671 retains one confirmed cell type, so it yields no testable pair. Null combinations are index-aligned; ten permutations floor the empirical p at 1/11 = 0.091, so the null yield is a null control ("none in 10 label-shuffle nulls, empirical p ≤ 0.091"), never an FDR estimate. Replication statistics are computed on PAS identifiers; no ranked list of named switch genes is reported, because the PAS-to-gene assignment in the frozen v2 code mis-assigns PAS in overlapping loci (tool issue #99; the assignment half was fixed after the freeze by PR #104, merged to the development branch and carrying a documented residual tie-break case, and that fix is not in the code that produced these results).</w:t>
       </w:r>
     </w:p>
     <w:p>
@@ -4111,7 +4598,7 @@
         <w:t xml:space="preserve"> </w:t>
       </w:r>
       <w:r>
-        <w:t xml:space="preserve">defaults change, exploratory with respect to this paper's gates), and issues #94 (switch-test marker pre-selection), #95 (internal-priming filter and memory), #98 (</w:t>
+        <w:t xml:space="preserve">defaults change, exploratory with respect to this paper's gates), and issues #94 (switch-test marker pre-selection; still open, partially addressed by PR #105), #95 (internal-priming filter and memory; closed 2026-09-04, its minus-strand and memory fixes being PRs #96 and #97 above), #98 (</w:t>
       </w:r>
       <w:r>
         <w:rPr>
@@ -4123,7 +4610,37 @@
         <w:t xml:space="preserve"> </w:t>
       </w:r>
       <w:r>
-        <w:t xml:space="preserve">degenerate pairs), #99 (PAS-to-gene assignment in overlapping loci and the clip-rate sampling estimator) and #101 (dynamic-threshold crash and documentation defects). The frozen commits used in this paper are</w:t>
+        <w:t xml:space="preserve">degenerate pairs; closed by PR #106), #99 (PAS-to-gene assignment in overlapping loci and the clip-rate sampling estimator; closed by PRs #104 and #100 respectively) and #101 (dynamic-threshold crash and documentation defects; closed by PR #102). PRs #96 and #97 are in the frozen v2 commit — v2 is PR #97's merge commit — so the minus-strand internal-priming and memory fixes are part of the code that produced the results reported here. Every other fix named above (PRs #100, #102, #104, #105 and #106) was merged to</w:t>
+      </w:r>
+      <w:r>
+        <w:t xml:space="preserve"> </w:t>
+      </w:r>
+      <w:r>
+        <w:rPr>
+          <w:rStyle w:val="VerbatimChar"/>
+        </w:rPr>
+        <w:t xml:space="preserve">develop</w:t>
+      </w:r>
+      <w:r>
+        <w:t xml:space="preserve"> </w:t>
+      </w:r>
+      <w:r>
+        <w:t xml:space="preserve">on 3–4 September 2026, after both frozen commits;</w:t>
+      </w:r>
+      <w:r>
+        <w:t xml:space="preserve"> </w:t>
+      </w:r>
+      <w:r>
+        <w:rPr>
+          <w:rStyle w:val="VerbatimChar"/>
+        </w:rPr>
+        <w:t xml:space="preserve">develop</w:t>
+      </w:r>
+      <w:r>
+        <w:t xml:space="preserve"> </w:t>
+      </w:r>
+      <w:r>
+        <w:t xml:space="preserve">has since moved to version 0.3.0 and is 59 commits ahead of v2. The defects those five PRs fix are therefore all present in the code that produced every number in this paper, and every caveat attached to those results stands unchanged. The frozen commits used in this paper are</w:t>
       </w:r>
       <w:r>
         <w:t xml:space="preserve"> </w:t>

</xml_diff>